<commit_message>
Reorder intake forms: human fields first, agent instructions last
Put the "Who I Am" fill-in section at the top of both Word intake
forms so the human sees it immediately, and move the AI-agent
directive to the bottom under its own heading. The agent reads the
whole file, so order doesn't affect the build.

Co-authored-by: Cursor <cursoragent@cursor.com>
</commit_message>
<xml_diff>
--- a/_site/static/mysite/files/ACADEMIC_SITE_INTAKE.docx
+++ b/_site/static/mysite/files/ACADEMIC_SITE_INTAKE.docx
@@ -13,128 +13,9 @@
     <w:p>
       <w:r>
         <w:rPr>
-          <w:b/>
-        </w:rPr>
-        <w:t>To the AI assistant building this site:</w:t>
-      </w:r>
-      <w:r>
-        <w:t xml:space="preserve"> This document contains </w:t>
-      </w:r>
-      <w:r>
-        <w:rPr>
           <w:i/>
         </w:rPr>
-        <w:t>only</w:t>
-      </w:r>
-      <w:r>
-        <w:t xml:space="preserve"> the information about me (the </w:t>
-      </w:r>
-      <w:r>
-        <w:rPr>
-          <w:b/>
-        </w:rPr>
-        <w:t>Who I Am</w:t>
-      </w:r>
-      <w:r>
-        <w:t xml:space="preserve"> section below). The complete, authoritative website-building instructions are published online. Once I have filled in my details below, do the following:</w:t>
-      </w:r>
-    </w:p>
-    <w:p>
-      <w:pPr>
-        <w:pStyle w:val="ListNumber"/>
-      </w:pPr>
-      <w:r>
-        <w:rPr>
-          <w:b/>
-        </w:rPr>
-        <w:t>Retrieve the full build instructions</w:t>
-      </w:r>
-      <w:r>
-        <w:t xml:space="preserve"> from this URL:</w:t>
-      </w:r>
-      <w:r>
-        <w:t xml:space="preserve"> </w:t>
-      </w:r>
-      <w:r>
-        <w:rPr>
-          <w:b/>
-        </w:rPr>
-        <w:t>https://gking.harvard.edu/mysite/files/ACADEMIC_SITE_PROMPT.md</w:t>
-      </w:r>
-    </w:p>
-    <w:p>
-      <w:pPr>
-        <w:pStyle w:val="ListNumber"/>
-      </w:pPr>
-      <w:r>
-        <w:rPr>
-          <w:b/>
-        </w:rPr>
-        <w:t>Follow that document exactly</w:t>
-      </w:r>
-      <w:r>
-        <w:t xml:space="preserve"> to build the site, using the </w:t>
-      </w:r>
-      <w:r>
-        <w:rPr>
-          <w:b/>
-        </w:rPr>
-        <w:t>Who I Am</w:t>
-      </w:r>
-      <w:r>
-        <w:t xml:space="preserve"> </w:t>
-      </w:r>
-      <w:r>
-        <w:t xml:space="preserve">details below as the content. (That document repeats a blank </w:t>
-      </w:r>
-      <w:r>
-        <w:rPr>
-          <w:i/>
-        </w:rPr>
-        <w:t>Who I Am</w:t>
-      </w:r>
-      <w:r>
-        <w:t xml:space="preserve"> </w:t>
-      </w:r>
-      <w:r>
-        <w:t>template near its top — ignore it; the filled-in version below takes</w:t>
-      </w:r>
-      <w:r>
-        <w:t xml:space="preserve"> </w:t>
-      </w:r>
-      <w:r>
-        <w:t>precedence.)</w:t>
-      </w:r>
-    </w:p>
-    <w:p>
-      <w:pPr>
-        <w:pStyle w:val="ListNumber"/>
-      </w:pPr>
-      <w:r>
-        <w:rPr>
-          <w:b/>
-        </w:rPr>
-        <w:t>Build a local preview and show it to me</w:t>
-      </w:r>
-      <w:r>
-        <w:t xml:space="preserve"> before anything goes public.</w:t>
-      </w:r>
-    </w:p>
-    <w:p>
-      <w:pPr>
-        <w:pStyle w:val="IntenseQuote"/>
-      </w:pPr>
-      <w:r>
-        <w:t xml:space="preserve">This requires an AI assistant with </w:t>
-      </w:r>
-      <w:r>
-        <w:rPr>
-          <w:b/>
-        </w:rPr>
-        <w:t>agent capabilities</w:t>
-      </w:r>
-      <w:r>
-        <w:t xml:space="preserve"> — it must be able to fetch a web page and create, build, and publish files on its own (for example Cursor, Claude Code, or OpenAI Codex). A plain browser chatbot that cannot retrieve the instructions above and build the files will not work.</w:t>
+        <w:t>Fill in the fields below. The instructions at the end are for your AI assistant — you don't need to read them.</w:t>
       </w:r>
     </w:p>
     <w:p>
@@ -402,14 +283,90 @@
       </w:pPr>
     </w:p>
     <w:p>
+      <w:pPr>
+        <w:pStyle w:val="Heading1"/>
+      </w:pPr>
+      <w:r>
+        <w:t>Instructions for the AI assistant</w:t>
+      </w:r>
+    </w:p>
+    <w:p>
       <w:r>
         <w:rPr>
           <w:b/>
         </w:rPr>
-        <w:t>That's all I need to provide.</w:t>
+        <w:t>Build this website from the information above.</w:t>
       </w:r>
       <w:r>
-        <w:t xml:space="preserve"> Now fetch the full instructions at the URL above and build my site from them.</w:t>
+        <w:t xml:space="preserve"> Once the </w:t>
+      </w:r>
+      <w:r>
+        <w:rPr>
+          <w:b/>
+        </w:rPr>
+        <w:t>Who I Am</w:t>
+      </w:r>
+      <w:r>
+        <w:t xml:space="preserve"> section is filled in:</w:t>
+      </w:r>
+    </w:p>
+    <w:p>
+      <w:pPr>
+        <w:pStyle w:val="ListNumber"/>
+      </w:pPr>
+      <w:r>
+        <w:t>Retrieve the full website-building instructions from this URL:</w:t>
+      </w:r>
+      <w:r>
+        <w:t xml:space="preserve"> </w:t>
+      </w:r>
+      <w:r>
+        <w:rPr>
+          <w:b/>
+        </w:rPr>
+        <w:t>https://gking.harvard.edu/mysite/files/ACADEMIC_SITE_PROMPT.md</w:t>
+      </w:r>
+    </w:p>
+    <w:p>
+      <w:pPr>
+        <w:pStyle w:val="ListNumber"/>
+      </w:pPr>
+      <w:r>
+        <w:t xml:space="preserve">Follow that document exactly to build the site, using the </w:t>
+      </w:r>
+      <w:r>
+        <w:rPr>
+          <w:b/>
+        </w:rPr>
+        <w:t>Who I Am</w:t>
+      </w:r>
+      <w:r>
+        <w:t xml:space="preserve"> details above as the content. (That document repeats a blank </w:t>
+      </w:r>
+      <w:r>
+        <w:rPr>
+          <w:i/>
+        </w:rPr>
+        <w:t>Who I Am</w:t>
+      </w:r>
+      <w:r>
+        <w:t xml:space="preserve"> template near its top — ignore it; the filled-in version above takes precedence.)</w:t>
+      </w:r>
+    </w:p>
+    <w:p>
+      <w:pPr>
+        <w:pStyle w:val="ListNumber"/>
+      </w:pPr>
+      <w:r>
+        <w:t>Build a local preview and show it to me before anything goes public.</w:t>
+      </w:r>
+    </w:p>
+    <w:p>
+      <w:pPr>
+        <w:pStyle w:val="IntenseQuote"/>
+      </w:pPr>
+      <w:r>
+        <w:t>This requires an AI assistant with agent capabilities — it must be able to fetch a web page and create, build, and publish files on its own (for example Cursor, Claude Code, or OpenAI Codex). A plain browser chatbot that cannot retrieve the instructions above and build the files will not work.</w:t>
       </w:r>
     </w:p>
     <w:sectPr>

</xml_diff>